<commit_message>
Updated slides and worksheets for first session, part of issue #10
</commit_message>
<xml_diff>
--- a/Documents/Budget_Worksheet.docx
+++ b/Documents/Budget_Worksheet.docx
@@ -162,14 +162,38 @@
               <w:cnfStyle w:val="000000000000" w:firstRow="0" w:lastRow="0" w:firstColumn="0" w:lastColumn="0" w:oddVBand="0" w:evenVBand="0" w:oddHBand="0" w:evenHBand="0" w:firstRowFirstColumn="0" w:firstRowLastColumn="0" w:lastRowFirstColumn="0" w:lastRowLastColumn="0"/>
             </w:pPr>
             <w:r>
-              <w:t xml:space="preserve">Look up stipend at </w:t>
+              <w:t xml:space="preserve">F31 – </w:t>
+            </w:r>
+            <w:r>
+              <w:rPr>
+                <w:rFonts w:ascii="Segoe UI" w:hAnsi="Segoe UI" w:cs="Segoe UI"/>
+                <w:color w:val="24292E"/>
+                <w:shd w:val="clear" w:color="auto" w:fill="FFFFFF"/>
+              </w:rPr>
+              <w:t>28,788</w:t>
+            </w:r>
+          </w:p>
+          <w:p>
+            <w:pPr>
+              <w:cnfStyle w:val="000000000000" w:firstRow="0" w:lastRow="0" w:firstColumn="0" w:lastColumn="0" w:oddVBand="0" w:evenVBand="0" w:oddHBand="0" w:evenHBand="0" w:firstRowFirstColumn="0" w:firstRowLastColumn="0" w:lastRowFirstColumn="0" w:lastRowLastColumn="0"/>
+            </w:pPr>
+            <w:r>
+              <w:t>F32 – varies by year</w:t>
+            </w:r>
+          </w:p>
+          <w:p>
+            <w:pPr>
+              <w:cnfStyle w:val="000000000000" w:firstRow="0" w:lastRow="0" w:firstColumn="0" w:lastColumn="0" w:oddVBand="0" w:evenVBand="0" w:oddHBand="0" w:evenHBand="0" w:firstRowFirstColumn="0" w:firstRowLastColumn="0" w:lastRowFirstColumn="0" w:lastRowLastColumn="0"/>
+            </w:pPr>
+            <w:r>
+              <w:t xml:space="preserve">See </w:t>
             </w:r>
             <w:hyperlink r:id="rId5" w:history="1">
               <w:r>
                 <w:rPr>
                   <w:rStyle w:val="Hyperlink"/>
                 </w:rPr>
-                <w:t>https://grants.nih.gov/grants/guide/notice-files/NOT-OD-24-104.html</w:t>
+                <w:t>https://grants.nih.gov/grants/guide/notice-files/NOT-OD-25-105.html</w:t>
               </w:r>
             </w:hyperlink>
           </w:p>
@@ -375,11 +399,17 @@
             </w:r>
             <w:proofErr w:type="gramStart"/>
             <w:r>
-              <w:t>so</w:t>
+              <w:t xml:space="preserve">so </w:t>
+            </w:r>
+            <w:r>
+              <w:t>,</w:t>
+            </w:r>
+            <w:r>
+              <w:t>how</w:t>
             </w:r>
             <w:proofErr w:type="gramEnd"/>
             <w:r>
-              <w:t xml:space="preserve"> how many credits?</w:t>
+              <w:t xml:space="preserve"> many credits?</w:t>
             </w:r>
           </w:p>
           <w:p>
@@ -404,39 +434,7 @@
               <w:rPr>
                 <w:bCs/>
               </w:rPr>
-              <w:t>$2,329</w:t>
-            </w:r>
-            <w:r>
-              <w:rPr>
-                <w:bCs/>
-              </w:rPr>
-              <w:t xml:space="preserve">/credit (resident) </w:t>
-            </w:r>
-            <w:proofErr w:type="gramStart"/>
-            <w:r>
-              <w:rPr>
-                <w:bCs/>
-              </w:rPr>
-              <w:t xml:space="preserve">or  </w:t>
-            </w:r>
-            <w:r>
-              <w:rPr>
-                <w:bCs/>
-              </w:rPr>
-              <w:t>$</w:t>
-            </w:r>
-            <w:proofErr w:type="gramEnd"/>
-            <w:r>
-              <w:rPr>
-                <w:bCs/>
-              </w:rPr>
-              <w:t>3,608</w:t>
-            </w:r>
-            <w:r>
-              <w:rPr>
-                <w:bCs/>
-              </w:rPr>
-              <w:t>/credit (nonresident)</w:t>
+              <w:t>60% of tuition up to $4500/year</w:t>
             </w:r>
           </w:p>
         </w:tc>

</xml_diff>